<commit_message>
Se agregan casos de uso y se sincroniza Entregable Integral
</commit_message>
<xml_diff>
--- a/Entregables/Entregable Integral/Documento Integral Polizing.docx
+++ b/Entregables/Entregable Integral/Documento Integral Polizing.docx
@@ -130,87 +130,7 @@
           <w:sz w:val="20"/>
           <w:szCs w:val="20"/>
         </w:rPr>
-        <w:t>Ducos Manuel</w:t>
-      </w:r>
-      <w:r>
-        <w:rPr>
-          <w:color w:val="595959"/>
-          <w:sz w:val="20"/>
-          <w:szCs w:val="20"/>
-        </w:rPr>
-        <w:t xml:space="preserve"> · </w:t>
-      </w:r>
-      <w:r>
-        <w:rPr>
-          <w:color w:val="595959"/>
-          <w:sz w:val="20"/>
-          <w:szCs w:val="20"/>
-        </w:rPr>
-        <w:t>Echavarria Agustin</w:t>
-      </w:r>
-      <w:r>
-        <w:rPr>
-          <w:color w:val="595959"/>
-          <w:sz w:val="20"/>
-          <w:szCs w:val="20"/>
-        </w:rPr>
-        <w:t xml:space="preserve"> · </w:t>
-      </w:r>
-      <w:r>
-        <w:rPr>
-          <w:color w:val="595959"/>
-          <w:sz w:val="20"/>
-          <w:szCs w:val="20"/>
-        </w:rPr>
-        <w:t>Felder David</w:t>
-      </w:r>
-      <w:r>
-        <w:rPr>
-          <w:color w:val="595959"/>
-          <w:sz w:val="20"/>
-          <w:szCs w:val="20"/>
-        </w:rPr>
-        <w:t xml:space="preserve"> · </w:t>
-      </w:r>
-      <w:r>
-        <w:rPr>
-          <w:color w:val="595959"/>
-          <w:sz w:val="20"/>
-          <w:szCs w:val="20"/>
-        </w:rPr>
-        <w:t>Ferraro Gonzalo</w:t>
-      </w:r>
-      <w:r>
-        <w:rPr>
-          <w:color w:val="595959"/>
-          <w:sz w:val="20"/>
-          <w:szCs w:val="20"/>
-        </w:rPr>
-        <w:t xml:space="preserve"> · </w:t>
-      </w:r>
-      <w:r>
-        <w:rPr>
-          <w:color w:val="595959"/>
-          <w:sz w:val="20"/>
-          <w:szCs w:val="20"/>
-        </w:rPr>
-        <w:t xml:space="preserve">Fueyo Luca </w:t>
-      </w:r>
-      <w:r>
-        <w:rPr>
-          <w:color w:val="595959"/>
-          <w:sz w:val="20"/>
-          <w:szCs w:val="20"/>
-        </w:rPr>
-        <w:t>·</w:t>
-      </w:r>
-      <w:r>
-        <w:rPr>
-          <w:color w:val="595959"/>
-          <w:sz w:val="20"/>
-          <w:szCs w:val="20"/>
-        </w:rPr>
-        <w:t xml:space="preserve"> Kravetz Marcos</w:t>
+        <w:t>Ducos Manuel · Echavarria Agustin · Felder David · Ferraro Gonzalo · Fueyo Luca · Kravetz Marcos</w:t>
       </w:r>
     </w:p>
     <w:p>
@@ -249,7 +169,6 @@
             <w:pPr>
               <w:widowControl w:val="0"/>
             </w:pPr>
-            <w:proofErr w:type="gramStart"/>
             <w:r>
               <w:rPr>
                 <w:i/>
@@ -258,18 +177,7 @@
                 <w:sz w:val="21"/>
                 <w:szCs w:val="21"/>
               </w:rPr>
-              <w:t>📘  INSTRUCCIONES</w:t>
-            </w:r>
-            <w:proofErr w:type="gramEnd"/>
-            <w:r>
-              <w:rPr>
-                <w:i/>
-                <w:iCs/>
-                <w:color w:val="1F4E79"/>
-                <w:sz w:val="21"/>
-                <w:szCs w:val="21"/>
-              </w:rPr>
-              <w:t xml:space="preserve"> PARA COMPLETAR ESTE DOCUMENTO. Los bloques en amarillo (✏️) son campos que el grupo debe completar con el contenido propio de su sistema. Los bloques en azul (📘) son instrucciones o aclaraciones sobre qué se espera en cada sección — se deben eliminar antes de la entrega final. El texto negro ya pre-estructurado puede adaptarse o reemplazarse según corresponda.</w:t>
+              <w:t>📘  INSTRUCCIONES PARA COMPLETAR ESTE DOCUMENTO. Los bloques en amarillo (✏️) son campos que el grupo debe completar con el contenido propio de su sistema. Los bloques en azul (📘) son instrucciones o aclaraciones sobre qué se espera en cada sección — se deben eliminar antes de la entrega final. El texto negro ya pre-estructurado puede adaptarse o reemplazarse según corresponda.</w:t>
             </w:r>
           </w:p>
         </w:tc>
@@ -290,7 +198,7 @@
     </w:p>
     <w:p>
       <w:pPr>
-        <w:pStyle w:val="Ttulo1"/>
+        <w:pStyle w:val="Heading1"/>
         <w:jc w:val="both"/>
       </w:pPr>
       <w:r>
@@ -356,15 +264,12 @@
     </w:p>
     <w:p>
       <w:pPr>
-        <w:pStyle w:val="Ttulo2"/>
+        <w:pStyle w:val="Heading2"/>
         <w:jc w:val="both"/>
       </w:pPr>
       <w:r>
         <w:lastRenderedPageBreak/>
-        <w:t>1.1 Actores</w:t>
-      </w:r>
-      <w:r>
-        <w:t xml:space="preserve"> del sistema</w:t>
+        <w:t>1.1 Actores del sistema</w:t>
       </w:r>
     </w:p>
     <w:p>
@@ -444,14 +349,11 @@
     </w:p>
     <w:p>
       <w:pPr>
-        <w:pStyle w:val="Ttulo2"/>
-        <w:jc w:val="both"/>
-      </w:pPr>
-      <w:r>
-        <w:t>1.2 Sistemas</w:t>
-      </w:r>
-      <w:r>
-        <w:t xml:space="preserve"> externos </w:t>
+        <w:pStyle w:val="Heading2"/>
+        <w:jc w:val="both"/>
+      </w:pPr>
+      <w:r>
+        <w:t xml:space="preserve">1.2 Sistemas externos </w:t>
       </w:r>
     </w:p>
     <w:p>
@@ -544,26 +446,12 @@
         <w:rPr>
           <w:lang w:val="es-AR"/>
         </w:rPr>
-        <w:t xml:space="preserve"> — equivalente a la </w:t>
-      </w:r>
-      <w:proofErr w:type="gramStart"/>
-      <w:r>
-        <w:rPr>
-          <w:lang w:val="es-AR"/>
-        </w:rPr>
-        <w:t>anterior</w:t>
-      </w:r>
-      <w:proofErr w:type="gramEnd"/>
-      <w:r>
-        <w:rPr>
-          <w:lang w:val="es-AR"/>
-        </w:rPr>
-        <w:t xml:space="preserve"> pero para la aseguradora Berkley. Mismo flujo (Polizing llama al externo) pero sobre protocolo SOAP, lo que obliga a una capa adaptadora distinta a la de Federación Patronal.</w:t>
-      </w:r>
-    </w:p>
-    <w:p>
-      <w:pPr>
-        <w:pStyle w:val="Ttulo2"/>
+        <w:t xml:space="preserve"> — equivalente a la anterior pero para la aseguradora Berkley. Mismo flujo (Polizing llama al externo) pero sobre protocolo SOAP, lo que obliga a una capa adaptadora distinta a la de Federación Patronal.</w:t>
+      </w:r>
+    </w:p>
+    <w:p>
+      <w:pPr>
+        <w:pStyle w:val="Heading2"/>
         <w:jc w:val="both"/>
       </w:pPr>
       <w:r>
@@ -1032,7 +920,7 @@
     </w:p>
     <w:p>
       <w:pPr>
-        <w:pStyle w:val="Ttulo2"/>
+        <w:pStyle w:val="Heading2"/>
         <w:jc w:val="both"/>
       </w:pPr>
       <w:r>
@@ -1823,36 +1711,34 @@
         <w:rPr>
           <w:lang w:val="es-AR"/>
         </w:rPr>
-        <w:t>Listar clientes</w:t>
-      </w:r>
-    </w:p>
-    <w:p>
-      <w:pPr>
-        <w:spacing w:before="80" w:after="80"/>
-        <w:jc w:val="both"/>
-        <w:rPr>
-          <w:lang w:val="es-AR"/>
-        </w:rPr>
-      </w:pPr>
-      <w:r>
-        <w:rPr>
-          <w:lang w:val="es-AR"/>
-        </w:rPr>
-        <w:t>CU-</w:t>
-      </w:r>
-      <w:proofErr w:type="gramStart"/>
-      <w:r>
-        <w:rPr>
-          <w:lang w:val="es-AR"/>
-        </w:rPr>
-        <w:t>71 :</w:t>
-      </w:r>
-      <w:proofErr w:type="gramEnd"/>
-      <w:r>
-        <w:rPr>
-          <w:lang w:val="es-AR"/>
-        </w:rPr>
-        <w:t xml:space="preserve"> Listar Polizas</w:t>
+        <w:t xml:space="preserve">Listar </w:t>
+      </w:r>
+      <w:r>
+        <w:rPr>
+          <w:lang w:val="es-AR"/>
+        </w:rPr>
+        <w:t>C</w:t>
+      </w:r>
+      <w:r>
+        <w:rPr>
+          <w:lang w:val="es-AR"/>
+        </w:rPr>
+        <w:t>lientes</w:t>
+      </w:r>
+    </w:p>
+    <w:p>
+      <w:pPr>
+        <w:spacing w:before="80" w:after="80"/>
+        <w:jc w:val="both"/>
+        <w:rPr>
+          <w:lang w:val="es-AR"/>
+        </w:rPr>
+      </w:pPr>
+      <w:r>
+        <w:rPr>
+          <w:lang w:val="es-AR"/>
+        </w:rPr>
+        <w:t>CU-71: Listar Polizas</w:t>
       </w:r>
     </w:p>
     <w:p>
@@ -1882,21 +1768,102 @@
         <w:rPr>
           <w:lang w:val="es-AR"/>
         </w:rPr>
-        <w:t>CU-73 Listar Empresas</w:t>
-      </w:r>
-    </w:p>
-    <w:p>
-      <w:pPr>
-        <w:spacing w:before="80" w:after="80"/>
-        <w:jc w:val="both"/>
-        <w:rPr>
-          <w:lang w:val="es-AR"/>
-        </w:rPr>
-      </w:pPr>
-    </w:p>
-    <w:p>
-      <w:pPr>
-        <w:pStyle w:val="Ttulo2"/>
+        <w:t xml:space="preserve">CU-73 Listar </w:t>
+      </w:r>
+      <w:r>
+        <w:rPr>
+          <w:lang w:val="es-AR"/>
+        </w:rPr>
+        <w:t>Aseguradoras</w:t>
+      </w:r>
+    </w:p>
+    <w:p>
+      <w:pPr>
+        <w:spacing w:before="80" w:after="80"/>
+        <w:jc w:val="both"/>
+        <w:rPr>
+          <w:lang w:val="es-AR"/>
+        </w:rPr>
+      </w:pPr>
+      <w:r>
+        <w:rPr>
+          <w:lang w:val="es-AR"/>
+        </w:rPr>
+        <w:t>CU-7</w:t>
+      </w:r>
+      <w:r>
+        <w:rPr>
+          <w:lang w:val="es-AR"/>
+        </w:rPr>
+        <w:t>4</w:t>
+      </w:r>
+      <w:r>
+        <w:rPr>
+          <w:lang w:val="es-AR"/>
+        </w:rPr>
+        <w:t xml:space="preserve"> Listar </w:t>
+      </w:r>
+      <w:r>
+        <w:rPr>
+          <w:lang w:val="es-AR"/>
+        </w:rPr>
+        <w:t>Siniestros</w:t>
+      </w:r>
+    </w:p>
+    <w:p>
+      <w:pPr>
+        <w:spacing w:before="80" w:after="80"/>
+        <w:jc w:val="both"/>
+        <w:rPr>
+          <w:lang w:val="es-AR"/>
+        </w:rPr>
+      </w:pPr>
+      <w:r>
+        <w:rPr>
+          <w:lang w:val="es-AR"/>
+        </w:rPr>
+        <w:t>CU-7</w:t>
+      </w:r>
+      <w:r>
+        <w:rPr>
+          <w:lang w:val="es-AR"/>
+        </w:rPr>
+        <w:t>5</w:t>
+      </w:r>
+      <w:r>
+        <w:rPr>
+          <w:lang w:val="es-AR"/>
+        </w:rPr>
+        <w:t xml:space="preserve"> Listar </w:t>
+      </w:r>
+      <w:r>
+        <w:rPr>
+          <w:lang w:val="es-AR"/>
+        </w:rPr>
+        <w:t>Noticias</w:t>
+      </w:r>
+    </w:p>
+    <w:p>
+      <w:pPr>
+        <w:spacing w:before="80" w:after="80"/>
+        <w:jc w:val="both"/>
+        <w:rPr>
+          <w:lang w:val="es-AR"/>
+        </w:rPr>
+      </w:pPr>
+    </w:p>
+    <w:p>
+      <w:pPr>
+        <w:spacing w:before="80" w:after="80"/>
+        <w:jc w:val="both"/>
+        <w:rPr>
+          <w:lang w:val="es-AR"/>
+        </w:rPr>
+      </w:pPr>
+    </w:p>
+    <w:p>
+      <w:pPr>
+        <w:pStyle w:val="Heading2"/>
         <w:jc w:val="both"/>
       </w:pPr>
       <w:r>
@@ -1949,6 +1916,10 @@
         <w:jc w:val="both"/>
       </w:pPr>
       <w:r>
+        <w:rPr>
+          <w:noProof/>
+        </w:rPr>
+        <w:lastRenderedPageBreak/>
         <w:drawing>
           <wp:inline distT="0" distB="0" distL="0" distR="0" wp14:anchorId="43636AB5" wp14:editId="1F43AE64">
             <wp:extent cx="5731510" cy="5269865"/>
@@ -1988,11 +1959,10 @@
     </w:p>
     <w:p>
       <w:pPr>
-        <w:pStyle w:val="Ttulo2"/>
-        <w:jc w:val="both"/>
-      </w:pPr>
-      <w:r>
-        <w:lastRenderedPageBreak/>
+        <w:pStyle w:val="Heading2"/>
+        <w:jc w:val="both"/>
+      </w:pPr>
+      <w:r>
         <w:t>1.6 Modelo Conceptual de Datos consistente con el Modelo de Entidad Relación o con el Diagrama de Clases, según corresponda</w:t>
       </w:r>
     </w:p>
@@ -2015,25 +1985,7 @@
           <w:lang w:val="es-AR" w:eastAsia="es-AR"/>
           <w14:ligatures w14:val="standardContextual"/>
         </w:rPr>
-        <w:t>El modelo conceptual coincide con la jerarquía de conceptos definida en el Glosari</w:t>
-      </w:r>
-      <w:r>
-        <w:rPr>
-          <w:rFonts w:eastAsia="Times New Roman"/>
-          <w:kern w:val="2"/>
-          <w:lang w:val="es-AR" w:eastAsia="es-AR"/>
-          <w14:ligatures w14:val="standardContextual"/>
-        </w:rPr>
-        <w:t>o</w:t>
-      </w:r>
-      <w:r>
-        <w:rPr>
-          <w:rFonts w:eastAsia="Times New Roman"/>
-          <w:kern w:val="2"/>
-          <w:lang w:val="es-AR" w:eastAsia="es-AR"/>
-          <w14:ligatures w14:val="standardContextual"/>
-        </w:rPr>
-        <w:t xml:space="preserve"> y materializada en el ERD:</w:t>
+        <w:t>El modelo conceptual coincide con la jerarquía de conceptos definida en el Glosario y materializada en el ERD:</w:t>
       </w:r>
     </w:p>
     <w:p>
@@ -2381,6 +2333,7 @@
           <w:lang w:val="es-AR" w:eastAsia="es-AR"/>
           <w14:ligatures w14:val="standardContextual"/>
         </w:rPr>
+        <w:lastRenderedPageBreak/>
         <w:tab/>
         <w:t>•</w:t>
       </w:r>
@@ -2432,7 +2385,7 @@
     </w:p>
     <w:p>
       <w:pPr>
-        <w:pStyle w:val="Ttulo1"/>
+        <w:pStyle w:val="Heading1"/>
         <w:jc w:val="both"/>
       </w:pPr>
       <w:r>
@@ -2472,7 +2425,7 @@
     </w:p>
     <w:p>
       <w:pPr>
-        <w:pStyle w:val="Prrafodelista"/>
+        <w:pStyle w:val="ListParagraph"/>
         <w:numPr>
           <w:ilvl w:val="0"/>
           <w:numId w:val="3"/>
@@ -2486,7 +2439,7 @@
     </w:p>
     <w:p>
       <w:pPr>
-        <w:pStyle w:val="Prrafodelista"/>
+        <w:pStyle w:val="ListParagraph"/>
         <w:numPr>
           <w:ilvl w:val="0"/>
           <w:numId w:val="1"/>
@@ -2500,7 +2453,7 @@
     </w:p>
     <w:p>
       <w:pPr>
-        <w:pStyle w:val="Prrafodelista"/>
+        <w:pStyle w:val="ListParagraph"/>
         <w:numPr>
           <w:ilvl w:val="0"/>
           <w:numId w:val="1"/>
@@ -2520,7 +2473,7 @@
     </w:p>
     <w:p>
       <w:pPr>
-        <w:pStyle w:val="Ttulo1"/>
+        <w:pStyle w:val="Heading1"/>
         <w:jc w:val="both"/>
       </w:pPr>
       <w:r>
@@ -2559,14 +2512,11 @@
     </w:p>
     <w:p>
       <w:pPr>
-        <w:pStyle w:val="Ttulo2"/>
-        <w:jc w:val="both"/>
-      </w:pPr>
-      <w:r>
-        <w:t>2.1.1 Flujos</w:t>
-      </w:r>
-      <w:r>
-        <w:t xml:space="preserve"> principales identificados</w:t>
+        <w:pStyle w:val="Heading2"/>
+        <w:jc w:val="both"/>
+      </w:pPr>
+      <w:r>
+        <w:t>2.1.1 Flujos principales identificados</w:t>
       </w:r>
     </w:p>
     <w:p>
@@ -2771,14 +2721,11 @@
     </w:p>
     <w:p>
       <w:pPr>
-        <w:pStyle w:val="Ttulo2"/>
-        <w:jc w:val="both"/>
-      </w:pPr>
-      <w:r>
-        <w:t>2.1.2 Decisiones</w:t>
-      </w:r>
-      <w:r>
-        <w:t xml:space="preserve"> de diseño en el nivel de contexto</w:t>
+        <w:pStyle w:val="Heading2"/>
+        <w:jc w:val="both"/>
+      </w:pPr>
+      <w:r>
+        <w:t>2.1.2 Decisiones de diseño en el nivel de contexto</w:t>
       </w:r>
     </w:p>
     <w:p>
@@ -2897,7 +2844,7 @@
     </w:p>
     <w:p>
       <w:pPr>
-        <w:pStyle w:val="Ttulo1"/>
+        <w:pStyle w:val="Heading1"/>
         <w:jc w:val="both"/>
       </w:pPr>
       <w:r>
@@ -2924,40 +2871,31 @@
     </w:p>
     <w:p>
       <w:pPr>
-        <w:pStyle w:val="Ttulo2"/>
-        <w:jc w:val="both"/>
-      </w:pPr>
-      <w:r>
-        <w:t>2.2.1 Contenedores</w:t>
-      </w:r>
-      <w:r>
-        <w:t xml:space="preserve"> del sistema</w:t>
-      </w:r>
-    </w:p>
-    <w:p>
-      <w:pPr>
-        <w:spacing w:before="80" w:after="80"/>
-        <w:jc w:val="both"/>
-      </w:pPr>
-    </w:p>
-    <w:p>
-      <w:pPr>
-        <w:pStyle w:val="Ttulo3"/>
-        <w:jc w:val="both"/>
-      </w:pPr>
-      <w:r>
-        <w:t xml:space="preserve">Frontend </w:t>
-      </w:r>
-      <w:r>
-        <w:t xml:space="preserve">— </w:t>
-      </w:r>
-      <w:r>
-        <w:t>Next.js</w:t>
-      </w:r>
-    </w:p>
-    <w:p>
-      <w:pPr>
-        <w:pStyle w:val="Ttulo3"/>
+        <w:pStyle w:val="Heading2"/>
+        <w:jc w:val="both"/>
+      </w:pPr>
+      <w:r>
+        <w:t>2.2.1 Contenedores del sistema</w:t>
+      </w:r>
+    </w:p>
+    <w:p>
+      <w:pPr>
+        <w:spacing w:before="80" w:after="80"/>
+        <w:jc w:val="both"/>
+      </w:pPr>
+    </w:p>
+    <w:p>
+      <w:pPr>
+        <w:pStyle w:val="Heading3"/>
+        <w:jc w:val="both"/>
+      </w:pPr>
+      <w:r>
+        <w:t>Frontend — Next.js</w:t>
+      </w:r>
+    </w:p>
+    <w:p>
+      <w:pPr>
+        <w:pStyle w:val="Heading3"/>
         <w:jc w:val="both"/>
         <w:rPr>
           <w:sz w:val="22"/>
@@ -2987,7 +2925,7 @@
     </w:p>
     <w:p>
       <w:pPr>
-        <w:pStyle w:val="Ttulo3"/>
+        <w:pStyle w:val="Heading3"/>
         <w:jc w:val="both"/>
         <w:rPr>
           <w:lang w:val="en-US"/>
@@ -2997,19 +2935,7 @@
         <w:rPr>
           <w:lang w:val="en-US"/>
         </w:rPr>
-        <w:t>Backend</w:t>
-      </w:r>
-      <w:r>
-        <w:rPr>
-          <w:lang w:val="en-US"/>
-        </w:rPr>
-        <w:t xml:space="preserve">— </w:t>
-      </w:r>
-      <w:r>
-        <w:rPr>
-          <w:lang w:val="en-US"/>
-        </w:rPr>
-        <w:t>Next.js (App ro</w:t>
+        <w:t>Backend— Next.js (App ro</w:t>
       </w:r>
       <w:r>
         <w:rPr>
@@ -3042,17 +2968,11 @@
     </w:p>
     <w:p>
       <w:pPr>
-        <w:pStyle w:val="Ttulo3"/>
-        <w:jc w:val="both"/>
-      </w:pPr>
-      <w:r>
-        <w:t>Base de datos</w:t>
-      </w:r>
-      <w:r>
-        <w:t xml:space="preserve"> — </w:t>
-      </w:r>
-      <w:r>
-        <w:t>Supabase – PostgreeSQL</w:t>
+        <w:pStyle w:val="Heading3"/>
+        <w:jc w:val="both"/>
+      </w:pPr>
+      <w:r>
+        <w:t>Base de datos — Supabase – PostgreeSQL</w:t>
       </w:r>
     </w:p>
     <w:p>
@@ -3079,17 +2999,11 @@
     </w:p>
     <w:p>
       <w:pPr>
-        <w:pStyle w:val="Ttulo3"/>
-        <w:jc w:val="both"/>
-      </w:pPr>
-      <w:r>
-        <w:t xml:space="preserve">Sistema de Chatbot </w:t>
-      </w:r>
-      <w:r>
-        <w:t xml:space="preserve">— </w:t>
-      </w:r>
-      <w:r>
-        <w:t xml:space="preserve">API </w:t>
+        <w:pStyle w:val="Heading3"/>
+        <w:jc w:val="both"/>
+      </w:pPr>
+      <w:r>
+        <w:t xml:space="preserve">Sistema de Chatbot — API </w:t>
       </w:r>
       <w:r>
         <w:t>WhatsApp</w:t>
@@ -3100,7 +3014,7 @@
     </w:p>
     <w:p>
       <w:pPr>
-        <w:pStyle w:val="Ttulo3"/>
+        <w:pStyle w:val="Heading3"/>
         <w:jc w:val="both"/>
         <w:rPr>
           <w:sz w:val="22"/>
@@ -3124,7 +3038,7 @@
     </w:p>
     <w:p>
       <w:pPr>
-        <w:pStyle w:val="Ttulo3"/>
+        <w:pStyle w:val="Heading3"/>
         <w:jc w:val="both"/>
       </w:pPr>
       <w:r>
@@ -3145,7 +3059,7 @@
     </w:p>
     <w:p>
       <w:pPr>
-        <w:pStyle w:val="Ttulo3"/>
+        <w:pStyle w:val="Heading3"/>
         <w:jc w:val="both"/>
         <w:rPr>
           <w:sz w:val="22"/>
@@ -3176,14 +3090,11 @@
     </w:p>
     <w:p>
       <w:pPr>
-        <w:pStyle w:val="Ttulo2"/>
-        <w:jc w:val="both"/>
-      </w:pPr>
-      <w:r>
-        <w:t>2.2.2 Decisiones</w:t>
-      </w:r>
-      <w:r>
-        <w:t xml:space="preserve"> arquitectónicas</w:t>
+        <w:pStyle w:val="Heading2"/>
+        <w:jc w:val="both"/>
+      </w:pPr>
+      <w:r>
+        <w:t>2.2.2 Decisiones arquitectónicas</w:t>
       </w:r>
     </w:p>
     <w:p>
@@ -3293,7 +3204,7 @@
     </w:p>
     <w:p>
       <w:pPr>
-        <w:pStyle w:val="Ttulo3"/>
+        <w:pStyle w:val="Heading3"/>
         <w:jc w:val="both"/>
       </w:pPr>
       <w:r>
@@ -3351,7 +3262,7 @@
     </w:p>
     <w:p>
       <w:pPr>
-        <w:pStyle w:val="Ttulo3"/>
+        <w:pStyle w:val="Heading3"/>
         <w:jc w:val="both"/>
       </w:pPr>
       <w:r>
@@ -3422,7 +3333,7 @@
     </w:p>
     <w:p>
       <w:pPr>
-        <w:pStyle w:val="Ttulo3"/>
+        <w:pStyle w:val="Heading3"/>
         <w:jc w:val="both"/>
       </w:pPr>
       <w:r>
@@ -3475,7 +3386,7 @@
     </w:p>
     <w:p>
       <w:pPr>
-        <w:pStyle w:val="Ttulo1"/>
+        <w:pStyle w:val="Heading1"/>
         <w:jc w:val="both"/>
       </w:pPr>
       <w:r>
@@ -3496,14 +3407,11 @@
     </w:p>
     <w:p>
       <w:pPr>
-        <w:pStyle w:val="Ttulo2"/>
-        <w:jc w:val="both"/>
-      </w:pPr>
-      <w:r>
-        <w:t>2.3.1 Arquitectura</w:t>
-      </w:r>
-      <w:r>
-        <w:t xml:space="preserve"> interna adoptada</w:t>
+        <w:pStyle w:val="Heading2"/>
+        <w:jc w:val="both"/>
+      </w:pPr>
+      <w:r>
+        <w:t>2.3.1 Arquitectura interna adoptada</w:t>
       </w:r>
     </w:p>
     <w:p>
@@ -3640,25 +3548,22 @@
     </w:p>
     <w:p>
       <w:pPr>
-        <w:pStyle w:val="Ttulo2"/>
-        <w:jc w:val="both"/>
-      </w:pPr>
-      <w:r>
-        <w:t>2.3.2 Descripción</w:t>
-      </w:r>
-      <w:r>
-        <w:t xml:space="preserve"> de componentes</w:t>
-      </w:r>
-    </w:p>
-    <w:p>
-      <w:pPr>
-        <w:spacing w:before="80" w:after="80"/>
-        <w:jc w:val="both"/>
-      </w:pPr>
-    </w:p>
-    <w:p>
-      <w:pPr>
-        <w:pStyle w:val="Ttulo3"/>
+        <w:pStyle w:val="Heading2"/>
+        <w:jc w:val="both"/>
+      </w:pPr>
+      <w:r>
+        <w:t>2.3.2 Descripción de componentes</w:t>
+      </w:r>
+    </w:p>
+    <w:p>
+      <w:pPr>
+        <w:spacing w:before="80" w:after="80"/>
+        <w:jc w:val="both"/>
+      </w:pPr>
+    </w:p>
+    <w:p>
+      <w:pPr>
+        <w:pStyle w:val="Heading3"/>
         <w:jc w:val="both"/>
       </w:pPr>
       <w:r>
@@ -3801,22 +3706,22 @@
     </w:p>
     <w:p>
       <w:pPr>
-        <w:pStyle w:val="Ttulo3"/>
-        <w:jc w:val="both"/>
-        <w:rPr>
-          <w:lang w:val="es-AR"/>
-        </w:rPr>
-      </w:pPr>
-    </w:p>
-    <w:p>
-      <w:pPr>
-        <w:spacing w:before="80" w:after="80"/>
-        <w:jc w:val="both"/>
-      </w:pPr>
-    </w:p>
-    <w:p>
-      <w:pPr>
-        <w:pStyle w:val="Ttulo3"/>
+        <w:pStyle w:val="Heading3"/>
+        <w:jc w:val="both"/>
+        <w:rPr>
+          <w:lang w:val="es-AR"/>
+        </w:rPr>
+      </w:pPr>
+    </w:p>
+    <w:p>
+      <w:pPr>
+        <w:spacing w:before="80" w:after="80"/>
+        <w:jc w:val="both"/>
+      </w:pPr>
+    </w:p>
+    <w:p>
+      <w:pPr>
+        <w:pStyle w:val="Heading3"/>
         <w:jc w:val="both"/>
       </w:pPr>
       <w:r>
@@ -4026,22 +3931,22 @@
     </w:p>
     <w:p>
       <w:pPr>
-        <w:pStyle w:val="Ttulo3"/>
-        <w:jc w:val="both"/>
-        <w:rPr>
-          <w:lang w:val="es-AR"/>
-        </w:rPr>
-      </w:pPr>
-    </w:p>
-    <w:p>
-      <w:pPr>
-        <w:spacing w:before="80" w:after="80"/>
-        <w:jc w:val="both"/>
-      </w:pPr>
-    </w:p>
-    <w:p>
-      <w:pPr>
-        <w:pStyle w:val="Ttulo3"/>
+        <w:pStyle w:val="Heading3"/>
+        <w:jc w:val="both"/>
+        <w:rPr>
+          <w:lang w:val="es-AR"/>
+        </w:rPr>
+      </w:pPr>
+    </w:p>
+    <w:p>
+      <w:pPr>
+        <w:spacing w:before="80" w:after="80"/>
+        <w:jc w:val="both"/>
+      </w:pPr>
+    </w:p>
+    <w:p>
+      <w:pPr>
+        <w:pStyle w:val="Heading3"/>
         <w:jc w:val="both"/>
       </w:pPr>
       <w:r>
@@ -4126,10 +4031,16 @@
     </w:p>
     <w:p>
       <w:pPr>
-        <w:pStyle w:val="Ttulo1"/>
-        <w:jc w:val="both"/>
-      </w:pPr>
-      <w:r>
+        <w:pStyle w:val="Heading1"/>
+        <w:jc w:val="both"/>
+        <w:rPr>
+          <w:lang w:val="en-US"/>
+        </w:rPr>
+      </w:pPr>
+      <w:r>
+        <w:rPr>
+          <w:lang w:val="en-US"/>
+        </w:rPr>
         <w:lastRenderedPageBreak/>
         <w:t>3. Stack Tecnológico</w:t>
       </w:r>
@@ -4138,6 +4049,9 @@
       <w:pPr>
         <w:spacing w:before="80" w:after="80"/>
         <w:jc w:val="both"/>
+        <w:rPr>
+          <w:lang w:val="en-US"/>
+        </w:rPr>
       </w:pPr>
     </w:p>
     <w:p>
@@ -4884,7 +4798,7 @@
     </w:p>
     <w:p>
       <w:pPr>
-        <w:pStyle w:val="Ttulo1"/>
+        <w:pStyle w:val="Heading1"/>
         <w:jc w:val="both"/>
       </w:pPr>
       <w:r>
@@ -4899,14 +4813,11 @@
     </w:p>
     <w:p>
       <w:pPr>
-        <w:pStyle w:val="Ttulo2"/>
-        <w:jc w:val="both"/>
-      </w:pPr>
-      <w:r>
-        <w:t>4.1 Patrones</w:t>
-      </w:r>
-      <w:r>
-        <w:t xml:space="preserve"> aplicados</w:t>
+        <w:pStyle w:val="Heading2"/>
+        <w:jc w:val="both"/>
+      </w:pPr>
+      <w:r>
+        <w:t>4.1 Patrones aplicados</w:t>
       </w:r>
     </w:p>
     <w:p>
@@ -5113,14 +5024,11 @@
     </w:p>
     <w:p>
       <w:pPr>
-        <w:pStyle w:val="Ttulo2"/>
-        <w:jc w:val="both"/>
-      </w:pPr>
-      <w:r>
-        <w:t>4.2 Atributos</w:t>
-      </w:r>
-      <w:r>
-        <w:t xml:space="preserve"> de calidad</w:t>
+        <w:pStyle w:val="Heading2"/>
+        <w:jc w:val="both"/>
+      </w:pPr>
+      <w:r>
+        <w:t>4.2 Atributos de calidad</w:t>
       </w:r>
     </w:p>
     <w:p>
@@ -5150,17 +5058,7 @@
           <w:lang w:val="es-AR" w:eastAsia="es-AR"/>
           <w14:ligatures w14:val="standardContextual"/>
         </w:rPr>
-        <w:t xml:space="preserve"> </w:t>
-      </w:r>
-      <w:r>
-        <w:rPr>
-          <w:rFonts w:eastAsia="Times New Roman"/>
-          <w:b/>
-          <w:kern w:val="2"/>
-          <w:lang w:val="es-AR" w:eastAsia="es-AR"/>
-          <w14:ligatures w14:val="standardContextual"/>
-        </w:rPr>
-        <w:t>RNF-01 Seguridad (Confidencialidad e Integridad)</w:t>
+        <w:t xml:space="preserve"> RNF-01 Seguridad (Confidencialidad e Integridad)</w:t>
       </w:r>
     </w:p>
     <w:p>
@@ -5468,27 +5366,21 @@
     </w:p>
     <w:p>
       <w:pPr>
-        <w:pStyle w:val="Ttulo1"/>
+        <w:pStyle w:val="Heading1"/>
         <w:jc w:val="both"/>
       </w:pPr>
       <w:r>
         <w:lastRenderedPageBreak/>
-        <w:t>5. F</w:t>
-      </w:r>
-      <w:r>
-        <w:t>lujos Principales del Sistema</w:t>
-      </w:r>
-    </w:p>
-    <w:p>
-      <w:pPr>
-        <w:pStyle w:val="Ttulo2"/>
-        <w:jc w:val="both"/>
-      </w:pPr>
-      <w:r>
-        <w:t>5.1 Flujo</w:t>
-      </w:r>
-      <w:r>
-        <w:t xml:space="preserve"> de autenticación</w:t>
+        <w:t>5. Flujos Principales del Sistema</w:t>
+      </w:r>
+    </w:p>
+    <w:p>
+      <w:pPr>
+        <w:pStyle w:val="Heading2"/>
+        <w:jc w:val="both"/>
+      </w:pPr>
+      <w:r>
+        <w:t>5.1 Flujo de autenticación</w:t>
       </w:r>
     </w:p>
     <w:p>
@@ -5773,7 +5665,7 @@
     </w:p>
     <w:p>
       <w:pPr>
-        <w:pStyle w:val="Ttulo2"/>
+        <w:pStyle w:val="Heading2"/>
         <w:jc w:val="both"/>
       </w:pPr>
       <w:r>
@@ -6154,21 +6046,7 @@
         <w:rPr>
           <w:lang w:val="es-AR"/>
         </w:rPr>
-        <w:t xml:space="preserve"> y abre una transacción Postgres: inserta el siniestro y los N registros en siniestro_documentos atómicamente. La transacción registra modificado_por_id = NULL (alta automática vía chatbot) y modificado_en = </w:t>
-      </w:r>
-      <w:proofErr w:type="gramStart"/>
-      <w:r>
-        <w:rPr>
-          <w:lang w:val="es-AR"/>
-        </w:rPr>
-        <w:t>now(</w:t>
-      </w:r>
-      <w:proofErr w:type="gramEnd"/>
-      <w:r>
-        <w:rPr>
-          <w:lang w:val="es-AR"/>
-        </w:rPr>
-        <w:t>).</w:t>
+        <w:t xml:space="preserve"> y abre una transacción Postgres: inserta el siniestro y los N registros en siniestro_documentos atómicamente. La transacción registra modificado_por_id = NULL (alta automática vía chatbot) y modificado_en = now().</w:t>
       </w:r>
     </w:p>
     <w:p>
@@ -6259,7 +6137,7 @@
     </w:p>
     <w:p>
       <w:pPr>
-        <w:pStyle w:val="Ttulo2"/>
+        <w:pStyle w:val="Heading2"/>
         <w:jc w:val="both"/>
       </w:pPr>
       <w:r>
@@ -6521,7 +6399,7 @@
     </w:p>
     <w:p>
       <w:pPr>
-        <w:pStyle w:val="Ttulo1"/>
+        <w:pStyle w:val="Heading1"/>
         <w:jc w:val="both"/>
       </w:pPr>
       <w:r>
@@ -6625,21 +6503,7 @@
           <w:lang w:val="es-AR"/>
         </w:rPr>
         <w:tab/>
-        <w:t xml:space="preserve">El acoplamiento temporal entre chatbot y panel (sin colas intermedias) implica </w:t>
-      </w:r>
-      <w:proofErr w:type="gramStart"/>
-      <w:r>
-        <w:rPr>
-          <w:lang w:val="es-AR"/>
-        </w:rPr>
-        <w:t>que</w:t>
-      </w:r>
-      <w:proofErr w:type="gramEnd"/>
-      <w:r>
-        <w:rPr>
-          <w:lang w:val="es-AR"/>
-        </w:rPr>
-        <w:t xml:space="preserve"> si el panel cae, el bot no puede responder. Aceptado por simplicidad y porque el patrón conversacional es petición/respuesta.</w:t>
+        <w:t>El acoplamiento temporal entre chatbot y panel (sin colas intermedias) implica que si el panel cae, el bot no puede responder. Aceptado por simplicidad y porque el patrón conversacional es petición/respuesta.</w:t>
       </w:r>
     </w:p>
     <w:p>
@@ -7404,7 +7268,7 @@
     <w:name w:val="Normal"/>
     <w:qFormat/>
   </w:style>
-  <w:style w:type="paragraph" w:styleId="Ttulo1">
+  <w:style w:type="paragraph" w:styleId="Heading1">
     <w:name w:val="heading 1"/>
     <w:uiPriority w:val="9"/>
     <w:qFormat/>
@@ -7420,7 +7284,7 @@
       <w:szCs w:val="32"/>
     </w:rPr>
   </w:style>
-  <w:style w:type="paragraph" w:styleId="Ttulo2">
+  <w:style w:type="paragraph" w:styleId="Heading2">
     <w:name w:val="heading 2"/>
     <w:uiPriority w:val="9"/>
     <w:unhideWhenUsed/>
@@ -7437,7 +7301,7 @@
       <w:szCs w:val="26"/>
     </w:rPr>
   </w:style>
-  <w:style w:type="paragraph" w:styleId="Ttulo3">
+  <w:style w:type="paragraph" w:styleId="Heading3">
     <w:name w:val="heading 3"/>
     <w:uiPriority w:val="9"/>
     <w:unhideWhenUsed/>
@@ -7454,7 +7318,7 @@
       <w:szCs w:val="24"/>
     </w:rPr>
   </w:style>
-  <w:style w:type="paragraph" w:styleId="Ttulo4">
+  <w:style w:type="paragraph" w:styleId="Heading4">
     <w:name w:val="heading 4"/>
     <w:uiPriority w:val="9"/>
     <w:semiHidden/>
@@ -7469,7 +7333,7 @@
       <w:color w:val="2E74B5"/>
     </w:rPr>
   </w:style>
-  <w:style w:type="paragraph" w:styleId="Ttulo5">
+  <w:style w:type="paragraph" w:styleId="Heading5">
     <w:name w:val="heading 5"/>
     <w:uiPriority w:val="9"/>
     <w:semiHidden/>
@@ -7482,7 +7346,7 @@
       <w:color w:val="2E74B5"/>
     </w:rPr>
   </w:style>
-  <w:style w:type="paragraph" w:styleId="Ttulo6">
+  <w:style w:type="paragraph" w:styleId="Heading6">
     <w:name w:val="heading 6"/>
     <w:uiPriority w:val="9"/>
     <w:semiHidden/>
@@ -7495,12 +7359,13 @@
       <w:color w:val="1F4D78"/>
     </w:rPr>
   </w:style>
-  <w:style w:type="character" w:default="1" w:styleId="Fuentedeprrafopredeter">
+  <w:style w:type="character" w:default="1" w:styleId="DefaultParagraphFont">
     <w:name w:val="Default Paragraph Font"/>
     <w:uiPriority w:val="1"/>
+    <w:semiHidden/>
     <w:unhideWhenUsed/>
   </w:style>
-  <w:style w:type="table" w:default="1" w:styleId="Tablanormal">
+  <w:style w:type="table" w:default="1" w:styleId="TableNormal">
     <w:name w:val="Normal Table"/>
     <w:uiPriority w:val="99"/>
     <w:semiHidden/>
@@ -7515,7 +7380,7 @@
       </w:tblCellMar>
     </w:tblPr>
   </w:style>
-  <w:style w:type="numbering" w:default="1" w:styleId="Sinlista">
+  <w:style w:type="numbering" w:default="1" w:styleId="NoList">
     <w:name w:val="No List"/>
     <w:uiPriority w:val="99"/>
     <w:semiHidden/>
@@ -7546,9 +7411,9 @@
       <w:vertAlign w:val="superscript"/>
     </w:rPr>
   </w:style>
-  <w:style w:type="character" w:customStyle="1" w:styleId="TextonotapieCar">
-    <w:name w:val="Texto nota pie Car"/>
-    <w:link w:val="Textonotapie"/>
+  <w:style w:type="character" w:customStyle="1" w:styleId="FootnoteTextChar">
+    <w:name w:val="Footnote Text Char"/>
+    <w:link w:val="FootnoteText"/>
     <w:uiPriority w:val="99"/>
     <w:semiHidden/>
     <w:unhideWhenUsed/>
@@ -7574,9 +7439,9 @@
       <w:vertAlign w:val="superscript"/>
     </w:rPr>
   </w:style>
-  <w:style w:type="character" w:customStyle="1" w:styleId="TextonotaalfinalCar">
-    <w:name w:val="Texto nota al final Car"/>
-    <w:link w:val="Textonotaalfinal"/>
+  <w:style w:type="character" w:customStyle="1" w:styleId="EndnoteTextChar">
+    <w:name w:val="Endnote Text Char"/>
+    <w:link w:val="EndnoteText"/>
     <w:uiPriority w:val="99"/>
     <w:semiHidden/>
     <w:unhideWhenUsed/>
@@ -7586,9 +7451,9 @@
       <w:szCs w:val="20"/>
     </w:rPr>
   </w:style>
-  <w:style w:type="paragraph" w:styleId="Ttulo">
+  <w:style w:type="paragraph" w:styleId="Title">
     <w:name w:val="Title"/>
-    <w:next w:val="Textoindependiente"/>
+    <w:next w:val="BodyText"/>
     <w:uiPriority w:val="10"/>
     <w:qFormat/>
     <w:rPr>
@@ -7596,21 +7461,21 @@
       <w:szCs w:val="56"/>
     </w:rPr>
   </w:style>
-  <w:style w:type="paragraph" w:styleId="Textoindependiente">
+  <w:style w:type="paragraph" w:styleId="BodyText">
     <w:name w:val="Body Text"/>
     <w:basedOn w:val="Normal"/>
     <w:pPr>
       <w:spacing w:after="140" w:line="276" w:lineRule="auto"/>
     </w:pPr>
   </w:style>
-  <w:style w:type="paragraph" w:styleId="Lista">
+  <w:style w:type="paragraph" w:styleId="List">
     <w:name w:val="List"/>
-    <w:basedOn w:val="Textoindependiente"/>
+    <w:basedOn w:val="BodyText"/>
     <w:rPr>
       <w:rFonts w:cs="Lohit Devanagari"/>
     </w:rPr>
   </w:style>
-  <w:style w:type="paragraph" w:styleId="Descripcin">
+  <w:style w:type="paragraph" w:styleId="Caption">
     <w:name w:val="caption"/>
     <w:basedOn w:val="Normal"/>
     <w:qFormat/>
@@ -7645,13 +7510,13 @@
       <w:bCs/>
     </w:rPr>
   </w:style>
-  <w:style w:type="paragraph" w:styleId="Prrafodelista">
+  <w:style w:type="paragraph" w:styleId="ListParagraph">
     <w:name w:val="List Paragraph"/>
     <w:qFormat/>
   </w:style>
-  <w:style w:type="paragraph" w:styleId="Textonotapie">
+  <w:style w:type="paragraph" w:styleId="FootnoteText">
     <w:name w:val="footnote text"/>
-    <w:link w:val="TextonotapieCar"/>
+    <w:link w:val="FootnoteTextChar"/>
     <w:uiPriority w:val="99"/>
     <w:semiHidden/>
     <w:unhideWhenUsed/>
@@ -7660,9 +7525,9 @@
       <w:szCs w:val="20"/>
     </w:rPr>
   </w:style>
-  <w:style w:type="paragraph" w:styleId="Textonotaalfinal">
+  <w:style w:type="paragraph" w:styleId="EndnoteText">
     <w:name w:val="endnote text"/>
-    <w:link w:val="TextonotaalfinalCar"/>
+    <w:link w:val="EndnoteTextChar"/>
     <w:uiPriority w:val="99"/>
     <w:semiHidden/>
     <w:unhideWhenUsed/>

</xml_diff>